<commit_message>
Superscript the equal-contribution marker in the PDF as well as the site
The last two authors' "&2" markers printed inline in the preprint PDF instead
of raised. fetch_prose.py emitted raw "<sup>&amp;2</sup>": the site honoured it
but LaTeX drops the tags and prints a literal "&2". The affiliation digits are
Unicode "¹"/"²", which both formats raise on their own, and there is no
superscript ampersand to match.

Emit a [.supmarker] span instead, turned into \textsuperscript{} by
fig-number.lua for LaTeX, raised by theme-house.scss for HTML, and rendered as
a real superscript run in the Word title page.

fig-number.lua now handles both span classes in ONE Span function: pandoc calls
a single handler, so adding a second `function Span` silently replaced the
first and would have dropped the figure-number accent.

Co-Authored-By: Claude Opus 5 <noreply@anthropic.com>
</commit_message>
<xml_diff>
--- a/submission/eurosurveillance/01_Title_page.docx
+++ b/submission/eurosurveillance/01_Title_page.docx
@@ -38,7 +38,22 @@
     </w:p>
     <w:p>
       <w:r>
-        <w:t>David Simon,¹ Timothy J. Locksmith², Nicholas R. Minor², Isla E. Emmen², Nancy A. Wilson², Eli J. O’Connor², Shelby L. O'Connor&amp;2, David H. O'Connor&amp;2</w:t>
+        <w:t>David Simon,¹ Timothy J. Locksmith², Nicholas R. Minor², Isla E. Emmen², Nancy A. Wilson², Eli J. O’Connor², Shelby L. O'Connor</w:t>
+      </w:r>
+      <w:r>
+        <w:rPr>
+          <w:vertAlign w:val="superscript"/>
+        </w:rPr>
+        <w:t>&amp;2</w:t>
+      </w:r>
+      <w:r>
+        <w:t>, David H. O'Connor</w:t>
+      </w:r>
+      <w:r>
+        <w:rPr>
+          <w:vertAlign w:val="superscript"/>
+        </w:rPr>
+        <w:t>&amp;2</w:t>
       </w:r>
     </w:p>
     <w:p>

</xml_diff>